<commit_message>
Add per-institution seed outreach emails for the founder.
Keep ready-to-send subject lines and bodies private so they are not forwarded with the investor memo.

Co-authored-by: Cursor <cursoragent@cursor.com>
</commit_message>
<xml_diff>
--- a/docs/seed-round-202609/机构投递清单与邮件模板.docx
+++ b/docs/seed-round-202609/机构投递清单与邮件模板.docx
@@ -1952,6 +1952,42 @@
           <w:rFonts w:hint="eastAsia"/>
         </w:rPr>
         <w:t xml:space="preserve">档位说成付费；说「档位已开通，确认到账仍极薄，这正是本轮要解决的问题」。</w:t>
+      </w:r>
+    </w:p>
+    <w:p>
+      <w:r>
+        <w:pict>
+          <v:rect style="width:0;height:1.5pt" o:hralign="center" o:hrstd="t" o:hr="t"/>
+        </w:pict>
+      </w:r>
+    </w:p>
+    <w:p>
+      <w:pPr>
+        <w:pStyle w:val="FirstParagraph"/>
+      </w:pPr>
+      <w:r>
+        <w:rPr>
+          <w:rFonts w:hint="eastAsia"/>
+        </w:rPr>
+        <w:t xml:space="preserve">各机构完整邮件（主题</w:t>
+      </w:r>
+      <w:r>
+        <w:t xml:space="preserve"> + </w:t>
+      </w:r>
+      <w:r>
+        <w:rPr>
+          <w:rFonts w:hint="eastAsia"/>
+        </w:rPr>
+        <w:t xml:space="preserve">正文</w:t>
+      </w:r>
+      <w:r>
+        <w:t xml:space="preserve"> + </w:t>
+      </w:r>
+      <w:r>
+        <w:rPr>
+          <w:rFonts w:hint="eastAsia"/>
+        </w:rPr>
+        <w:t xml:space="preserve">收件人）见同目录《各机构邮件模板》。下面只留三类主题和一封通用底稿。</w:t>
       </w:r>
     </w:p>
     <w:p>

</xml_diff>

<commit_message>
Add a packer that builds one mail folder per investor.
Each folder gets the institution email plus the two Word attachments, so outreach can be sent without mixing files.

Co-authored-by: Cursor <cursoragent@cursor.com>
</commit_message>
<xml_diff>
--- a/docs/seed-round-202609/机构投递清单与邮件模板.docx
+++ b/docs/seed-round-202609/机构投递清单与邮件模板.docx
@@ -1969,25 +1969,32 @@
         <w:rPr>
           <w:rFonts w:hint="eastAsia"/>
         </w:rPr>
-        <w:t xml:space="preserve">各机构完整邮件（主题</w:t>
-      </w:r>
-      <w:r>
-        <w:t xml:space="preserve"> + </w:t>
-      </w:r>
-      <w:r>
-        <w:rPr>
-          <w:rFonts w:hint="eastAsia"/>
-        </w:rPr>
-        <w:t xml:space="preserve">正文</w:t>
-      </w:r>
-      <w:r>
-        <w:t xml:space="preserve"> + </w:t>
-      </w:r>
-      <w:r>
-        <w:rPr>
-          <w:rFonts w:hint="eastAsia"/>
-        </w:rPr>
-        <w:t xml:space="preserve">收件人）见同目录《各机构邮件模板》。下面只留三类主题和一封通用底稿。</w:t>
+        <w:t xml:space="preserve">各机构完整邮件见同目录《各机构邮件模板》。桌面按机构分好的文件夹：</w:t>
+      </w:r>
+      <w:r>
+        <w:rPr>
+          <w:rStyle w:val="VerbatimChar"/>
+          <w:rFonts w:hint="eastAsia"/>
+        </w:rPr>
+        <w:t xml:space="preserve">灵祺种子轮投融资资料-20260906/按机构发送/</w:t>
+      </w:r>
+      <w:r>
+        <w:rPr>
+          <w:rFonts w:hint="eastAsia"/>
+        </w:rPr>
+        <w:t xml:space="preserve">（重做：</w:t>
+      </w:r>
+      <w:r>
+        <w:rPr>
+          <w:rStyle w:val="VerbatimChar"/>
+        </w:rPr>
+        <w:t xml:space="preserve">python3 scripts/pack_investor_mail_folders.py</w:t>
+      </w:r>
+      <w:r>
+        <w:rPr>
+          <w:rFonts w:hint="eastAsia"/>
+        </w:rPr>
+        <w:t xml:space="preserve">）。下面只留三类主题和一封通用底稿。</w:t>
       </w:r>
     </w:p>
     <w:p>

</xml_diff>